<commit_message>
Use plain titles for Nuve and Big Bus (leadership in line one and bullets); soften records wording; rebuild resume files
Co-Authored-By: Claude Sonnet 5.5 <noreply@anthropic.com>
Claude-Session: https://claude.ai/code/session_01CqgPnUhu85kgkJtKT7yWgc
</commit_message>
<xml_diff>
--- a/servicetitan-sdm/send-ready/Johnny_Scott_Jorgenson_Resume.docx
+++ b/servicetitan-sdm/send-ready/Johnny_Scott_Jorgenson_Resume.docx
@@ -389,7 +389,7 @@
           <w:sz w:val="21"/>
           <w:szCs w:val="21"/>
         </w:rPr>
-        <w:t xml:space="preserve">Founding SDR (Team Lead Duties) / Enablement | Nuve</w:t>
+        <w:t xml:space="preserve">Founding SDR | Enablement | Nuve</w:t>
       </w:r>
     </w:p>
     <w:p>
@@ -776,7 +776,7 @@
           <w:sz w:val="21"/>
           <w:szCs w:val="21"/>
         </w:rPr>
-        <w:t xml:space="preserve">Lead Sales Rep (promoted from Street Sales Rep) | Big Bus Tours</w:t>
+        <w:t xml:space="preserve">Lead Sales Rep | Big Bus Tours</w:t>
       </w:r>
     </w:p>
     <w:p>
@@ -812,7 +812,7 @@
           <w:sz w:val="20"/>
           <w:szCs w:val="20"/>
         </w:rPr>
-        <w:t xml:space="preserve">As Lead Sales Rep, trained 8+ new sales reps, tracked their daily performance, and reassigned reps to territories to improve results.</w:t>
+        <w:t xml:space="preserve">Promoted from Street Sales Rep to Lead Sales Rep: trained 8+ new sales reps, tracked their daily performance, and reassigned reps to territories to improve results.</w:t>
       </w:r>
     </w:p>
     <w:p>

</xml_diff>